<commit_message>
Rework Idea 1 imagery: real, dramatic, rights-clear photos (6-slide carousel)
</commit_message>
<xml_diff>
--- a/public/Instagram Briefings/Ideas September 2026/Idea 1 - AI Shoppers Convert Better.docx
+++ b/public/Instagram Briefings/Ideas September 2026/Idea 1 - AI Shoppers Convert Better.docx
@@ -73,7 +73,7 @@
         <w:rPr>
           <w:color w:val="6B7280"/>
         </w:rPr>
-        <w:t xml:space="preserve">2026-09-06   ·   Business &amp; Strategy   ·   CAROUSEL (8 slides)</w:t>
+        <w:t xml:space="preserve">2026-09-06   ·   Business &amp; Strategy   ·   CAROUSEL (6 slides)</w:t>
       </w:r>
     </w:p>
     <w:p>
@@ -86,7 +86,7 @@
           <w:iCs/>
           <w:color w:val="6B7280"/>
         </w:rPr>
-        <w:t xml:space="preserve">Recommended: The idea has a real arc (old assumption, the number, the reversal, the mechanism, the gap, the pivot) that needs room to breathe, not one punch.</w:t>
+        <w:t xml:space="preserve">Recommended: Tightened from an 8 slide draft to 6 so every slide could carry a genuinely real, dramatic, rights clear photo (3 distinct sources, each used exactly twice) instead of stretching to a diagram or a mood shot just to fill a slide count.</w:t>
       </w:r>
     </w:p>
     <w:p>
@@ -157,7 +157,7 @@
         </w:rPr>
         <w:t xml:space="preserve">Source 1: </w:t>
       </w:r>
-      <w:hyperlink w:history="1" r:id="rIdpsdvjwijxqcboueswglvq">
+      <w:hyperlink w:history="1" r:id="rIdentxrvsifsya3kca7cngk">
         <w:r>
           <w:rPr>
             <w:rStyle w:val="Hyperlink"/>
@@ -178,7 +178,7 @@
         </w:rPr>
         <w:t xml:space="preserve">Source 2: </w:t>
       </w:r>
-      <w:hyperlink w:history="1" r:id="rIdvpcyoag2rd5j99xiuymlw">
+      <w:hyperlink w:history="1" r:id="rIdregwqrnhatmqgxzrbcrif">
         <w:r>
           <w:rPr>
             <w:rStyle w:val="Hyperlink"/>
@@ -199,7 +199,7 @@
         </w:rPr>
         <w:t xml:space="preserve">Source 3: </w:t>
       </w:r>
-      <w:hyperlink w:history="1" r:id="rId-tkssabc239hlkwctre4a">
+      <w:hyperlink w:history="1" r:id="rIdjy5y-esbjzf6kmkzhlnam">
         <w:r>
           <w:rPr>
             <w:rStyle w:val="Hyperlink"/>
@@ -561,70 +561,70 @@
                 <w:bCs w:val="false"/>
                 <w:color w:val="1A1A1A"/>
               </w:rPr>
-              <w:t xml:space="preserve">[THE OLD ASSUMPTION]</w:t>
-            </w:r>
-          </w:p>
-        </w:tc>
-        <w:tc>
-          <w:tcPr>
-            <w:tcW w:type="dxa" w:w="2820"/>
-            <w:tcMar>
-              <w:top w:type="dxa" w:w="80"/>
-              <w:left w:type="dxa" w:w="120"/>
-              <w:bottom w:type="dxa" w:w="80"/>
-              <w:right w:type="dxa" w:w="120"/>
-            </w:tcMar>
-          </w:tcPr>
-          <w:p>
-            <w:r>
-              <w:rPr>
-                <w:b w:val="false"/>
-                <w:bCs w:val="false"/>
-                <w:color w:val="1A1A1A"/>
-              </w:rPr>
-              <w:t xml:space="preserve">For years, any traffic coming from a bot or a crawler got filtered out of analytics as noise, not treated as a customer.</w:t>
-            </w:r>
-          </w:p>
-        </w:tc>
-        <w:tc>
-          <w:tcPr>
-            <w:tcW w:type="dxa" w:w="2820"/>
-            <w:tcMar>
-              <w:top w:type="dxa" w:w="80"/>
-              <w:left w:type="dxa" w:w="120"/>
-              <w:bottom w:type="dxa" w:w="80"/>
-              <w:right w:type="dxa" w:w="120"/>
-            </w:tcMar>
-          </w:tcPr>
-          <w:p>
-            <w:r>
-              <w:rPr>
-                <w:b w:val="false"/>
-                <w:bCs w:val="false"/>
-                <w:color w:val="1A1A1A"/>
-              </w:rPr>
-              <w:t xml:space="preserve">Durante anos, cualquier trafico que llegaba de un bot o un rastreador se filtraba de las analiticas como ruido, no como un cliente.</w:t>
-            </w:r>
-          </w:p>
-        </w:tc>
-        <w:tc>
-          <w:tcPr>
-            <w:tcW w:type="dxa" w:w="2820"/>
-            <w:tcMar>
-              <w:top w:type="dxa" w:w="80"/>
-              <w:left w:type="dxa" w:w="120"/>
-              <w:bottom w:type="dxa" w:w="80"/>
-              <w:right w:type="dxa" w:w="120"/>
-            </w:tcMar>
-          </w:tcPr>
-          <w:p>
-            <w:r>
-              <w:rPr>
-                <w:b w:val="false"/>
-                <w:bCs w:val="false"/>
-                <w:color w:val="1A1A1A"/>
-              </w:rPr>
-              <w:t xml:space="preserve">Por anos, qualquer trafego vindo de um bot ou rastreador era filtrado das analises como ruido, nunca tratado como cliente.</w:t>
+              <w:t xml:space="preserve">[62%]</w:t>
+            </w:r>
+          </w:p>
+        </w:tc>
+        <w:tc>
+          <w:tcPr>
+            <w:tcW w:type="dxa" w:w="2820"/>
+            <w:tcMar>
+              <w:top w:type="dxa" w:w="80"/>
+              <w:left w:type="dxa" w:w="120"/>
+              <w:bottom w:type="dxa" w:w="80"/>
+              <w:right w:type="dxa" w:w="120"/>
+            </w:tcMar>
+          </w:tcPr>
+          <w:p>
+            <w:r>
+              <w:rPr>
+                <w:b w:val="false"/>
+                <w:bCs w:val="false"/>
+                <w:color w:val="1A1A1A"/>
+              </w:rPr>
+              <w:t xml:space="preserve">Adobe Analytics says AI referred traffic to US retail sites grew 62% year over year in July 2026, and it is up more than 1,200% since October 2024. A year ago that same traffic was filtered out of dashboards as noise.</w:t>
+            </w:r>
+          </w:p>
+        </w:tc>
+        <w:tc>
+          <w:tcPr>
+            <w:tcW w:type="dxa" w:w="2820"/>
+            <w:tcMar>
+              <w:top w:type="dxa" w:w="80"/>
+              <w:left w:type="dxa" w:w="120"/>
+              <w:bottom w:type="dxa" w:w="80"/>
+              <w:right w:type="dxa" w:w="120"/>
+            </w:tcMar>
+          </w:tcPr>
+          <w:p>
+            <w:r>
+              <w:rPr>
+                <w:b w:val="false"/>
+                <w:bCs w:val="false"/>
+                <w:color w:val="1A1A1A"/>
+              </w:rPr>
+              <w:t xml:space="preserve">Adobe Analytics dice que el trafico referido por IA a sitios minoristas de EE.UU. crecio 62% interanual en julio de 2026, y ya acumula mas de 1200% desde octubre de 2024. Hace un ano ese mismo trafico se filtraba de los paneles como ruido.</w:t>
+            </w:r>
+          </w:p>
+        </w:tc>
+        <w:tc>
+          <w:tcPr>
+            <w:tcW w:type="dxa" w:w="2820"/>
+            <w:tcMar>
+              <w:top w:type="dxa" w:w="80"/>
+              <w:left w:type="dxa" w:w="120"/>
+              <w:bottom w:type="dxa" w:w="80"/>
+              <w:right w:type="dxa" w:w="120"/>
+            </w:tcMar>
+          </w:tcPr>
+          <w:p>
+            <w:r>
+              <w:rPr>
+                <w:b w:val="false"/>
+                <w:bCs w:val="false"/>
+                <w:color w:val="1A1A1A"/>
+              </w:rPr>
+              <w:t xml:space="preserve">A Adobe Analytics afirma que o trafego vindo de IA para sites de varejo dos EUA cresceu 62% na comparacao anual em julho de 2026, e ja acumula mais de 1200% desde outubro de 2024. Ha um ano esse mesmo trafego era filtrado dos paineis como ruido.</w:t>
             </w:r>
           </w:p>
         </w:tc>
@@ -657,70 +657,70 @@
                 <w:bCs w:val="false"/>
                 <w:color w:val="1A1A1A"/>
               </w:rPr>
-              <w:t xml:space="preserve">[62%]</w:t>
-            </w:r>
-          </w:p>
-        </w:tc>
-        <w:tc>
-          <w:tcPr>
-            <w:tcW w:type="dxa" w:w="2820"/>
-            <w:tcMar>
-              <w:top w:type="dxa" w:w="80"/>
-              <w:left w:type="dxa" w:w="120"/>
-              <w:bottom w:type="dxa" w:w="80"/>
-              <w:right w:type="dxa" w:w="120"/>
-            </w:tcMar>
-          </w:tcPr>
-          <w:p>
-            <w:r>
-              <w:rPr>
-                <w:b w:val="false"/>
-                <w:bCs w:val="false"/>
-                <w:color w:val="1A1A1A"/>
-              </w:rPr>
-              <w:t xml:space="preserve">Adobe Analytics says AI referred traffic to US retail sites grew 62% year over year in July 2026, and it is up more than 1,200% since October 2024.</w:t>
-            </w:r>
-          </w:p>
-        </w:tc>
-        <w:tc>
-          <w:tcPr>
-            <w:tcW w:type="dxa" w:w="2820"/>
-            <w:tcMar>
-              <w:top w:type="dxa" w:w="80"/>
-              <w:left w:type="dxa" w:w="120"/>
-              <w:bottom w:type="dxa" w:w="80"/>
-              <w:right w:type="dxa" w:w="120"/>
-            </w:tcMar>
-          </w:tcPr>
-          <w:p>
-            <w:r>
-              <w:rPr>
-                <w:b w:val="false"/>
-                <w:bCs w:val="false"/>
-                <w:color w:val="1A1A1A"/>
-              </w:rPr>
-              <w:t xml:space="preserve">Adobe Analytics dice que el trafico referido por IA a sitios minoristas de EE.UU. crecio 62% interanual en julio de 2026, y ya acumula mas de 1200% desde octubre de 2024.</w:t>
-            </w:r>
-          </w:p>
-        </w:tc>
-        <w:tc>
-          <w:tcPr>
-            <w:tcW w:type="dxa" w:w="2820"/>
-            <w:tcMar>
-              <w:top w:type="dxa" w:w="80"/>
-              <w:left w:type="dxa" w:w="120"/>
-              <w:bottom w:type="dxa" w:w="80"/>
-              <w:right w:type="dxa" w:w="120"/>
-            </w:tcMar>
-          </w:tcPr>
-          <w:p>
-            <w:r>
-              <w:rPr>
-                <w:b w:val="false"/>
-                <w:bCs w:val="false"/>
-                <w:color w:val="1A1A1A"/>
-              </w:rPr>
-              <w:t xml:space="preserve">A Adobe Analytics afirma que o trafego vindo de IA para sites de varejo dos EUA cresceu 62% na comparacao anual em julho de 2026, e ja acumula mais de 1200% desde outubro de 2024.</w:t>
+              <w:t xml:space="preserve">[42%]</w:t>
+            </w:r>
+          </w:p>
+        </w:tc>
+        <w:tc>
+          <w:tcPr>
+            <w:tcW w:type="dxa" w:w="2820"/>
+            <w:tcMar>
+              <w:top w:type="dxa" w:w="80"/>
+              <w:left w:type="dxa" w:w="120"/>
+              <w:bottom w:type="dxa" w:w="80"/>
+              <w:right w:type="dxa" w:w="120"/>
+            </w:tcMar>
+          </w:tcPr>
+          <w:p>
+            <w:r>
+              <w:rPr>
+                <w:b w:val="false"/>
+                <w:bCs w:val="false"/>
+                <w:color w:val="1A1A1A"/>
+              </w:rPr>
+              <w:t xml:space="preserve">In March 2026 that same traffic converted 42% better than every other channel, a complete flip from converting 38% worse just one year earlier.</w:t>
+            </w:r>
+          </w:p>
+        </w:tc>
+        <w:tc>
+          <w:tcPr>
+            <w:tcW w:type="dxa" w:w="2820"/>
+            <w:tcMar>
+              <w:top w:type="dxa" w:w="80"/>
+              <w:left w:type="dxa" w:w="120"/>
+              <w:bottom w:type="dxa" w:w="80"/>
+              <w:right w:type="dxa" w:w="120"/>
+            </w:tcMar>
+          </w:tcPr>
+          <w:p>
+            <w:r>
+              <w:rPr>
+                <w:b w:val="false"/>
+                <w:bCs w:val="false"/>
+                <w:color w:val="1A1A1A"/>
+              </w:rPr>
+              <w:t xml:space="preserve">En marzo de 2026 ese mismo trafico convirtio 42% mejor que cualquier otro canal, un giro total frente a convertir 38% peor apenas un ano antes.</w:t>
+            </w:r>
+          </w:p>
+        </w:tc>
+        <w:tc>
+          <w:tcPr>
+            <w:tcW w:type="dxa" w:w="2820"/>
+            <w:tcMar>
+              <w:top w:type="dxa" w:w="80"/>
+              <w:left w:type="dxa" w:w="120"/>
+              <w:bottom w:type="dxa" w:w="80"/>
+              <w:right w:type="dxa" w:w="120"/>
+            </w:tcMar>
+          </w:tcPr>
+          <w:p>
+            <w:r>
+              <w:rPr>
+                <w:b w:val="false"/>
+                <w:bCs w:val="false"/>
+                <w:color w:val="1A1A1A"/>
+              </w:rPr>
+              <w:t xml:space="preserve">Em marco de 2026 esse mesmo trafego converteu 42% melhor que qualquer outro canal, uma virada completa em relacao a converter 38% pior apenas um ano antes.</w:t>
             </w:r>
           </w:p>
         </w:tc>
@@ -753,70 +753,70 @@
                 <w:bCs w:val="false"/>
                 <w:color w:val="1A1A1A"/>
               </w:rPr>
-              <w:t xml:space="preserve">[42%]</w:t>
-            </w:r>
-          </w:p>
-        </w:tc>
-        <w:tc>
-          <w:tcPr>
-            <w:tcW w:type="dxa" w:w="2820"/>
-            <w:tcMar>
-              <w:top w:type="dxa" w:w="80"/>
-              <w:left w:type="dxa" w:w="120"/>
-              <w:bottom w:type="dxa" w:w="80"/>
-              <w:right w:type="dxa" w:w="120"/>
-            </w:tcMar>
-          </w:tcPr>
-          <w:p>
-            <w:r>
-              <w:rPr>
-                <w:b w:val="false"/>
-                <w:bCs w:val="false"/>
-                <w:color w:val="1A1A1A"/>
-              </w:rPr>
-              <w:t xml:space="preserve">In March 2026 that same traffic converted 42% better than every other channel, a complete flip from converting 38% worse just one year earlier.</w:t>
-            </w:r>
-          </w:p>
-        </w:tc>
-        <w:tc>
-          <w:tcPr>
-            <w:tcW w:type="dxa" w:w="2820"/>
-            <w:tcMar>
-              <w:top w:type="dxa" w:w="80"/>
-              <w:left w:type="dxa" w:w="120"/>
-              <w:bottom w:type="dxa" w:w="80"/>
-              <w:right w:type="dxa" w:w="120"/>
-            </w:tcMar>
-          </w:tcPr>
-          <w:p>
-            <w:r>
-              <w:rPr>
-                <w:b w:val="false"/>
-                <w:bCs w:val="false"/>
-                <w:color w:val="1A1A1A"/>
-              </w:rPr>
-              <w:t xml:space="preserve">En marzo de 2026 ese mismo trafico convirtio 42% mejor que cualquier otro canal, un giro total frente a convertir 38% peor apenas un ano antes.</w:t>
-            </w:r>
-          </w:p>
-        </w:tc>
-        <w:tc>
-          <w:tcPr>
-            <w:tcW w:type="dxa" w:w="2820"/>
-            <w:tcMar>
-              <w:top w:type="dxa" w:w="80"/>
-              <w:left w:type="dxa" w:w="120"/>
-              <w:bottom w:type="dxa" w:w="80"/>
-              <w:right w:type="dxa" w:w="120"/>
-            </w:tcMar>
-          </w:tcPr>
-          <w:p>
-            <w:r>
-              <w:rPr>
-                <w:b w:val="false"/>
-                <w:bCs w:val="false"/>
-                <w:color w:val="1A1A1A"/>
-              </w:rPr>
-              <w:t xml:space="preserve">Em marco de 2026 esse mesmo trafego converteu 42% melhor que qualquer outro canal, uma virada completa em relacao a converter 38% pior apenas um ano antes.</w:t>
+              <w:t xml:space="preserve">[WHY IT CONVERTS]</w:t>
+            </w:r>
+          </w:p>
+        </w:tc>
+        <w:tc>
+          <w:tcPr>
+            <w:tcW w:type="dxa" w:w="2820"/>
+            <w:tcMar>
+              <w:top w:type="dxa" w:w="80"/>
+              <w:left w:type="dxa" w:w="120"/>
+              <w:bottom w:type="dxa" w:w="80"/>
+              <w:right w:type="dxa" w:w="120"/>
+            </w:tcMar>
+          </w:tcPr>
+          <w:p>
+            <w:r>
+              <w:rPr>
+                <w:b w:val="false"/>
+                <w:bCs w:val="false"/>
+                <w:color w:val="1A1A1A"/>
+              </w:rPr>
+              <w:t xml:space="preserve">An AI assistant does not browse out of curiosity. It only sends a person through once it has already decided the page answers what they asked for.</w:t>
+            </w:r>
+          </w:p>
+        </w:tc>
+        <w:tc>
+          <w:tcPr>
+            <w:tcW w:type="dxa" w:w="2820"/>
+            <w:tcMar>
+              <w:top w:type="dxa" w:w="80"/>
+              <w:left w:type="dxa" w:w="120"/>
+              <w:bottom w:type="dxa" w:w="80"/>
+              <w:right w:type="dxa" w:w="120"/>
+            </w:tcMar>
+          </w:tcPr>
+          <w:p>
+            <w:r>
+              <w:rPr>
+                <w:b w:val="false"/>
+                <w:bCs w:val="false"/>
+                <w:color w:val="1A1A1A"/>
+              </w:rPr>
+              <w:t xml:space="preserve">Un asistente de IA no navega por curiosidad. Solo envia a una persona cuando ya decidio que la pagina responde justo lo que pidio.</w:t>
+            </w:r>
+          </w:p>
+        </w:tc>
+        <w:tc>
+          <w:tcPr>
+            <w:tcW w:type="dxa" w:w="2820"/>
+            <w:tcMar>
+              <w:top w:type="dxa" w:w="80"/>
+              <w:left w:type="dxa" w:w="120"/>
+              <w:bottom w:type="dxa" w:w="80"/>
+              <w:right w:type="dxa" w:w="120"/>
+            </w:tcMar>
+          </w:tcPr>
+          <w:p>
+            <w:r>
+              <w:rPr>
+                <w:b w:val="false"/>
+                <w:bCs w:val="false"/>
+                <w:color w:val="1A1A1A"/>
+              </w:rPr>
+              <w:t xml:space="preserve">Um assistente de IA nao navega por curiosidade. Ele so manda uma pessoa quando ja decidiu que a pagina responde exatamente o que foi pedido.</w:t>
             </w:r>
           </w:p>
         </w:tc>
@@ -849,70 +849,70 @@
                 <w:bCs w:val="false"/>
                 <w:color w:val="1A1A1A"/>
               </w:rPr>
-              <w:t xml:space="preserve">[WHY IT CONVERTS]</w:t>
-            </w:r>
-          </w:p>
-        </w:tc>
-        <w:tc>
-          <w:tcPr>
-            <w:tcW w:type="dxa" w:w="2820"/>
-            <w:tcMar>
-              <w:top w:type="dxa" w:w="80"/>
-              <w:left w:type="dxa" w:w="120"/>
-              <w:bottom w:type="dxa" w:w="80"/>
-              <w:right w:type="dxa" w:w="120"/>
-            </w:tcMar>
-          </w:tcPr>
-          <w:p>
-            <w:r>
-              <w:rPr>
-                <w:b w:val="false"/>
-                <w:bCs w:val="false"/>
-                <w:color w:val="1A1A1A"/>
-              </w:rPr>
-              <w:t xml:space="preserve">An AI assistant does not browse out of curiosity. It only sends a person through once it has already decided the page answers what they asked for.</w:t>
-            </w:r>
-          </w:p>
-        </w:tc>
-        <w:tc>
-          <w:tcPr>
-            <w:tcW w:type="dxa" w:w="2820"/>
-            <w:tcMar>
-              <w:top w:type="dxa" w:w="80"/>
-              <w:left w:type="dxa" w:w="120"/>
-              <w:bottom w:type="dxa" w:w="80"/>
-              <w:right w:type="dxa" w:w="120"/>
-            </w:tcMar>
-          </w:tcPr>
-          <w:p>
-            <w:r>
-              <w:rPr>
-                <w:b w:val="false"/>
-                <w:bCs w:val="false"/>
-                <w:color w:val="1A1A1A"/>
-              </w:rPr>
-              <w:t xml:space="preserve">Un asistente de IA no navega por curiosidad. Solo envia a una persona cuando ya decidio que la pagina responde justo lo que pidio.</w:t>
-            </w:r>
-          </w:p>
-        </w:tc>
-        <w:tc>
-          <w:tcPr>
-            <w:tcW w:type="dxa" w:w="2820"/>
-            <w:tcMar>
-              <w:top w:type="dxa" w:w="80"/>
-              <w:left w:type="dxa" w:w="120"/>
-              <w:bottom w:type="dxa" w:w="80"/>
-              <w:right w:type="dxa" w:w="120"/>
-            </w:tcMar>
-          </w:tcPr>
-          <w:p>
-            <w:r>
-              <w:rPr>
-                <w:b w:val="false"/>
-                <w:bCs w:val="false"/>
-                <w:color w:val="1A1A1A"/>
-              </w:rPr>
-              <w:t xml:space="preserve">Um assistente de IA nao navega por curiosidade. Ele so manda uma pessoa quando ja decidiu que a pagina responde exatamente o que foi pedido.</w:t>
+              <w:t xml:space="preserve">[THE GAP]</w:t>
+            </w:r>
+          </w:p>
+        </w:tc>
+        <w:tc>
+          <w:tcPr>
+            <w:tcW w:type="dxa" w:w="2820"/>
+            <w:tcMar>
+              <w:top w:type="dxa" w:w="80"/>
+              <w:left w:type="dxa" w:w="120"/>
+              <w:bottom w:type="dxa" w:w="80"/>
+              <w:right w:type="dxa" w:w="120"/>
+            </w:tcMar>
+          </w:tcPr>
+          <w:p>
+            <w:r>
+              <w:rPr>
+                <w:b w:val="false"/>
+                <w:bCs w:val="false"/>
+                <w:color w:val="1A1A1A"/>
+              </w:rPr>
+              <w:t xml:space="preserve">Most product pages are still written for a search engine and a pair of human eyes, never for the model deciding what to recommend. Adobe just launched a free tool to check, because almost no retailer had, and that audit is the one worth running now.</w:t>
+            </w:r>
+          </w:p>
+        </w:tc>
+        <w:tc>
+          <w:tcPr>
+            <w:tcW w:type="dxa" w:w="2820"/>
+            <w:tcMar>
+              <w:top w:type="dxa" w:w="80"/>
+              <w:left w:type="dxa" w:w="120"/>
+              <w:bottom w:type="dxa" w:w="80"/>
+              <w:right w:type="dxa" w:w="120"/>
+            </w:tcMar>
+          </w:tcPr>
+          <w:p>
+            <w:r>
+              <w:rPr>
+                <w:b w:val="false"/>
+                <w:bCs w:val="false"/>
+                <w:color w:val="1A1A1A"/>
+              </w:rPr>
+              <w:t xml:space="preserve">La mayoria de las paginas de producto todavia estan escritas para un buscador y un par de ojos humanos, nunca para el modelo que decide que recomendar. Adobe acaba de lanzar una herramienta gratuita para revisar esto, porque casi ningun minorista lo habia hecho, y esa es la auditoria que vale la pena correr ahora.</w:t>
+            </w:r>
+          </w:p>
+        </w:tc>
+        <w:tc>
+          <w:tcPr>
+            <w:tcW w:type="dxa" w:w="2820"/>
+            <w:tcMar>
+              <w:top w:type="dxa" w:w="80"/>
+              <w:left w:type="dxa" w:w="120"/>
+              <w:bottom w:type="dxa" w:w="80"/>
+              <w:right w:type="dxa" w:w="120"/>
+            </w:tcMar>
+          </w:tcPr>
+          <w:p>
+            <w:r>
+              <w:rPr>
+                <w:b w:val="false"/>
+                <w:bCs w:val="false"/>
+                <w:color w:val="1A1A1A"/>
+              </w:rPr>
+              <w:t xml:space="preserve">A maioria das paginas de produto ainda e escrita para um buscador e um par de olhos humanos, nunca para o modelo que decide o que recomendar. A Adobe acabou de lancar uma ferramenta gratuita pra checar isso, porque quase nenhum varejista tinha feito, e essa e a auditoria que vale a pena rodar agora.</w:t>
             </w:r>
           </w:p>
         </w:tc>
@@ -938,198 +938,6 @@
               <w:t xml:space="preserve">6</w:t>
             </w:r>
           </w:p>
-          <w:p>
-            <w:r>
-              <w:rPr>
-                <w:b w:val="false"/>
-                <w:bCs w:val="false"/>
-                <w:color w:val="1A1A1A"/>
-              </w:rPr>
-              <w:t xml:space="preserve">[THE BLIND SPOT]</w:t>
-            </w:r>
-          </w:p>
-        </w:tc>
-        <w:tc>
-          <w:tcPr>
-            <w:tcW w:type="dxa" w:w="2820"/>
-            <w:tcMar>
-              <w:top w:type="dxa" w:w="80"/>
-              <w:left w:type="dxa" w:w="120"/>
-              <w:bottom w:type="dxa" w:w="80"/>
-              <w:right w:type="dxa" w:w="120"/>
-            </w:tcMar>
-          </w:tcPr>
-          <w:p>
-            <w:r>
-              <w:rPr>
-                <w:b w:val="false"/>
-                <w:bCs w:val="false"/>
-                <w:color w:val="1A1A1A"/>
-              </w:rPr>
-              <w:t xml:space="preserve">Most product pages are still written for a search engine and a pair of human eyes, never for the model quietly deciding what to recommend.</w:t>
-            </w:r>
-          </w:p>
-        </w:tc>
-        <w:tc>
-          <w:tcPr>
-            <w:tcW w:type="dxa" w:w="2820"/>
-            <w:tcMar>
-              <w:top w:type="dxa" w:w="80"/>
-              <w:left w:type="dxa" w:w="120"/>
-              <w:bottom w:type="dxa" w:w="80"/>
-              <w:right w:type="dxa" w:w="120"/>
-            </w:tcMar>
-          </w:tcPr>
-          <w:p>
-            <w:r>
-              <w:rPr>
-                <w:b w:val="false"/>
-                <w:bCs w:val="false"/>
-                <w:color w:val="1A1A1A"/>
-              </w:rPr>
-              <w:t xml:space="preserve">La mayoria de las paginas de producto todavia estan escritas para un buscador y un par de ojos humanos, nunca para el modelo que decide en silencio que recomendar.</w:t>
-            </w:r>
-          </w:p>
-        </w:tc>
-        <w:tc>
-          <w:tcPr>
-            <w:tcW w:type="dxa" w:w="2820"/>
-            <w:tcMar>
-              <w:top w:type="dxa" w:w="80"/>
-              <w:left w:type="dxa" w:w="120"/>
-              <w:bottom w:type="dxa" w:w="80"/>
-              <w:right w:type="dxa" w:w="120"/>
-            </w:tcMar>
-          </w:tcPr>
-          <w:p>
-            <w:r>
-              <w:rPr>
-                <w:b w:val="false"/>
-                <w:bCs w:val="false"/>
-                <w:color w:val="1A1A1A"/>
-              </w:rPr>
-              <w:t xml:space="preserve">A maioria das paginas de produto ainda e escrita para um buscador e um par de olhos humanos, nunca para o modelo que decide em silencio o que recomendar.</w:t>
-            </w:r>
-          </w:p>
-        </w:tc>
-      </w:tr>
-      <w:tr>
-        <w:tc>
-          <w:tcPr>
-            <w:tcW w:type="dxa" w:w="900"/>
-            <w:tcMar>
-              <w:top w:type="dxa" w:w="80"/>
-              <w:left w:type="dxa" w:w="120"/>
-              <w:bottom w:type="dxa" w:w="80"/>
-              <w:right w:type="dxa" w:w="120"/>
-            </w:tcMar>
-          </w:tcPr>
-          <w:p>
-            <w:r>
-              <w:rPr>
-                <w:b w:val="false"/>
-                <w:bCs w:val="false"/>
-                <w:color w:val="1A1A1A"/>
-              </w:rPr>
-              <w:t xml:space="preserve">7</w:t>
-            </w:r>
-          </w:p>
-          <w:p>
-            <w:r>
-              <w:rPr>
-                <w:b w:val="false"/>
-                <w:bCs w:val="false"/>
-                <w:color w:val="1A1A1A"/>
-              </w:rPr>
-              <w:t xml:space="preserve">[THE TAKEAWAY]</w:t>
-            </w:r>
-          </w:p>
-        </w:tc>
-        <w:tc>
-          <w:tcPr>
-            <w:tcW w:type="dxa" w:w="2820"/>
-            <w:tcMar>
-              <w:top w:type="dxa" w:w="80"/>
-              <w:left w:type="dxa" w:w="120"/>
-              <w:bottom w:type="dxa" w:w="80"/>
-              <w:right w:type="dxa" w:w="120"/>
-            </w:tcMar>
-          </w:tcPr>
-          <w:p>
-            <w:r>
-              <w:rPr>
-                <w:b w:val="false"/>
-                <w:bCs w:val="false"/>
-                <w:color w:val="1A1A1A"/>
-              </w:rPr>
-              <w:t xml:space="preserve">Adobe just launched a tool to check if a page is even readable to AI, because almost no retailer had verified it. That audit is the new one worth running.</w:t>
-            </w:r>
-          </w:p>
-        </w:tc>
-        <w:tc>
-          <w:tcPr>
-            <w:tcW w:type="dxa" w:w="2820"/>
-            <w:tcMar>
-              <w:top w:type="dxa" w:w="80"/>
-              <w:left w:type="dxa" w:w="120"/>
-              <w:bottom w:type="dxa" w:w="80"/>
-              <w:right w:type="dxa" w:w="120"/>
-            </w:tcMar>
-          </w:tcPr>
-          <w:p>
-            <w:r>
-              <w:rPr>
-                <w:b w:val="false"/>
-                <w:bCs w:val="false"/>
-                <w:color w:val="1A1A1A"/>
-              </w:rPr>
-              <w:t xml:space="preserve">Adobe acaba de lanzar una herramienta para revisar si una pagina es siquiera legible para la IA, porque casi ningun minorista lo habia comprobado. Esa es la auditoria que ahora vale la pena correr.</w:t>
-            </w:r>
-          </w:p>
-        </w:tc>
-        <w:tc>
-          <w:tcPr>
-            <w:tcW w:type="dxa" w:w="2820"/>
-            <w:tcMar>
-              <w:top w:type="dxa" w:w="80"/>
-              <w:left w:type="dxa" w:w="120"/>
-              <w:bottom w:type="dxa" w:w="80"/>
-              <w:right w:type="dxa" w:w="120"/>
-            </w:tcMar>
-          </w:tcPr>
-          <w:p>
-            <w:r>
-              <w:rPr>
-                <w:b w:val="false"/>
-                <w:bCs w:val="false"/>
-                <w:color w:val="1A1A1A"/>
-              </w:rPr>
-              <w:t xml:space="preserve">A Adobe acabou de lancar uma ferramenta pra checar se uma pagina e sequer legivel pra IA, porque quase nenhum varejista tinha verificado isso. Essa e a auditoria que agora vale a pena rodar.</w:t>
-            </w:r>
-          </w:p>
-        </w:tc>
-      </w:tr>
-      <w:tr>
-        <w:tc>
-          <w:tcPr>
-            <w:tcW w:type="dxa" w:w="900"/>
-            <w:tcMar>
-              <w:top w:type="dxa" w:w="80"/>
-              <w:left w:type="dxa" w:w="120"/>
-              <w:bottom w:type="dxa" w:w="80"/>
-              <w:right w:type="dxa" w:w="120"/>
-            </w:tcMar>
-          </w:tcPr>
-          <w:p>
-            <w:r>
-              <w:rPr>
-                <w:b w:val="false"/>
-                <w:bCs w:val="false"/>
-                <w:color w:val="1A1A1A"/>
-              </w:rPr>
-              <w:t xml:space="preserve">8</w:t>
-            </w:r>
-          </w:p>
         </w:tc>
         <w:tc>
           <w:tcPr>
@@ -1406,9 +1214,43 @@
           <w:bCs/>
           <w:color w:val="001A70"/>
         </w:rPr>
-        <w:t xml:space="preserve">Slide 1 (Hook) + Slide 8 (CTA, darkest crop) — close up of a hand holding a smartphone on the ChatGPT app home screen, a suggestion chip reading Design a database schema for an online merch store visible, blurred green leaves behind: </w:t>
-      </w:r>
-      <w:hyperlink w:history="1" r:id="rIdvy12zue_gfffb5cjd89sh">
+        <w:t xml:space="preserve">Slide 1 (Hook, wide) + Slide 4 (Why it converts, tight crop on face and gesture) — Sam Altman on stage at OpenAI DevDay 2025, the actual event where Instant Checkout (ChatGPT's AI shopping feature) was announced, dramatic black backdrop with AI DevDay in giant lettering, candid mid gesture: </w:t>
+      </w:r>
+      <w:hyperlink w:history="1" r:id="rIdxq8f6chwmazyllqocklb7">
+        <w:r>
+          <w:rPr>
+            <w:rStyle w:val="Hyperlink"/>
+          </w:rPr>
+          <w:t xml:space="preserve">https://images.ctfassets.net/kftzwdyauwt9/5wRvgt8XwwS7EtETdtZrZE/24248473bab31e681def40ae962f7ca7/78855?w=3840&amp;q=90&amp;fm=webp</w:t>
+        </w:r>
+      </w:hyperlink>
+    </w:p>
+    <w:p>
+      <w:pPr>
+        <w:spacing w:after="120"/>
+      </w:pPr>
+      <w:r>
+        <w:rPr>
+          <w:color w:val="6B7280"/>
+          <w:sz w:val="18"/>
+          <w:szCs w:val="18"/>
+        </w:rPr>
+        <w:t xml:space="preserve">Source: https://openai.com/devday    Author: OpenAI    License: Official OpenAI press photo, published on openai.com/devday</w:t>
+      </w:r>
+    </w:p>
+    <w:p>
+      <w:pPr>
+        <w:spacing w:after="20"/>
+      </w:pPr>
+      <w:r>
+        <w:rPr>
+          <w:b/>
+          <w:bCs/>
+          <w:color w:val="001A70"/>
+        </w:rPr>
+        <w:t xml:space="preserve">Slide 2 (The 62% number) + Slide 5 (The gap, tighter crop on the screen) — close up of a hand holding a smartphone on the actual ChatGPT app home screen, a suggestion chip reading Design a database schema for an online merch store visible on screen, blurred green leaves behind: </w:t>
+      </w:r>
+      <w:hyperlink w:history="1" r:id="rIdi0tnzmpzlbtkfzhdnbspq">
         <w:r>
           <w:rPr>
             <w:rStyle w:val="Hyperlink"/>
@@ -1440,9 +1282,9 @@
           <w:bCs/>
           <w:color w:val="001A70"/>
         </w:rPr>
-        <w:t xml:space="preserve">Slide 2 (The old assumption) + Slide 5 (Why it converts, tighter crop) — close up of a hand holding an iPhone showing OpenAI's Introducing ChatGPT page, an Artificial Intelligence textbook blurred underneath on a wood desk: </w:t>
-      </w:r>
-      <w:hyperlink w:history="1" r:id="rIdtzhp8y3nsg1gf-hrpyyah">
+        <w:t xml:space="preserve">Slide 3 (The 42% reversal) + Slide 6 (CTA, darkest crop) — close up of a hand holding an iPhone showing OpenAI's real Introducing ChatGPT page, an Artificial Intelligence textbook visible underneath on a wood desk, warm directional light: </w:t>
+      </w:r>
+      <w:hyperlink w:history="1" r:id="rIdv7kr_flxytrkydnpvkfv-">
         <w:r>
           <w:rPr>
             <w:rStyle w:val="Hyperlink"/>
@@ -1466,108 +1308,6 @@
     </w:p>
     <w:p>
       <w:pPr>
-        <w:spacing w:after="20"/>
-      </w:pPr>
-      <w:r>
-        <w:rPr>
-          <w:b/>
-          <w:bCs/>
-          <w:color w:val="001A70"/>
-        </w:rPr>
-        <w:t xml:space="preserve">Slide 3 (The 62% number) + Slide 7 (The takeaway, different crop) — cinematic night scene, illuminated glass panels showing silhouettes of lounge chairs, a person walking past checking their phone; Perplexity's own shopping launch hero art, used here as mood/atmosphere for the aggregate stat, not a literal interface shot (declared metaphor per image-sourcing.md's exception, since a conversion rate reversal has no single photographable moment): </w:t>
-      </w:r>
-      <w:hyperlink w:history="1" r:id="rIdmugxzbu5ayxysk15shv4z">
-        <w:r>
-          <w:rPr>
-            <w:rStyle w:val="Hyperlink"/>
-          </w:rPr>
-          <w:t xml:space="preserve">https://cdn.sanity.io/images/aqo64vfr/production/5117cf0300696926df7645ac961a7dec1a1bc54b-2464x1856.png</w:t>
-        </w:r>
-      </w:hyperlink>
-    </w:p>
-    <w:p>
-      <w:pPr>
-        <w:spacing w:after="120"/>
-      </w:pPr>
-      <w:r>
-        <w:rPr>
-          <w:color w:val="6B7280"/>
-          <w:sz w:val="18"/>
-          <w:szCs w:val="18"/>
-        </w:rPr>
-        <w:t xml:space="preserve">Source: https://www.perplexity.ai/hub/blog/shop-like-a-pro    Author: Perplexity    License: Official brand press image, used editorially with credit</w:t>
-      </w:r>
-    </w:p>
-    <w:p>
-      <w:pPr>
-        <w:spacing w:after="20"/>
-      </w:pPr>
-      <w:r>
-        <w:rPr>
-          <w:b/>
-          <w:bCs/>
-          <w:color w:val="001A70"/>
-        </w:rPr>
-        <w:t xml:space="preserve">Slide 4 (The reversal) — OpenAI's own official diagram of the Agentic Commerce Protocol powering ChatGPT Instant Checkout (User / ChatGPT / Merchant / Payment Processor swimlanes). Flagged: perfect subject match and official source, but it is a flat technical diagram, not a charged photograph, so it scores low on the Charge parameter (about 3/10) despite clearing every other bar. Three real search rounds did not turn up a photographable, charged, rights-clear alternative for this specific mechanism beat; shipping this with the gap named rather than swapping in a generic finance/tech metaphor.: </w:t>
-      </w:r>
-      <w:hyperlink w:history="1" r:id="rIdlucpb2mqixqlnab4kcnmo">
-        <w:r>
-          <w:rPr>
-            <w:rStyle w:val="Hyperlink"/>
-          </w:rPr>
-          <w:t xml:space="preserve">https://images.ctfassets.net/kftzwdyauwt9/7FFvwejzfPNgfhCnMGL0Zv/1137412461665141a7851dcc703d5e3f/ACP_-_POR__1_.png</w:t>
-        </w:r>
-      </w:hyperlink>
-    </w:p>
-    <w:p>
-      <w:pPr>
-        <w:spacing w:after="120"/>
-      </w:pPr>
-      <w:r>
-        <w:rPr>
-          <w:color w:val="6B7280"/>
-          <w:sz w:val="18"/>
-          <w:szCs w:val="18"/>
-        </w:rPr>
-        <w:t xml:space="preserve">Source: https://openai.com/index/buy-it-in-chatgpt    Author: OpenAI    License: Official brand press diagram, used editorially with credit</w:t>
-      </w:r>
-    </w:p>
-    <w:p>
-      <w:pPr>
-        <w:spacing w:after="20"/>
-      </w:pPr>
-      <w:r>
-        <w:rPr>
-          <w:b/>
-          <w:bCs/>
-          <w:color w:val="001A70"/>
-        </w:rPr>
-        <w:t xml:space="preserve">Slide 6 (The blind spot) — same OpenAI Agentic Commerce Protocol diagram, second and final use (max 2 slides), different focus crop (zoomed on the Merchant / Payment Processor lanes): </w:t>
-      </w:r>
-      <w:hyperlink w:history="1" r:id="rId2njs42414luuqxou8l2xc">
-        <w:r>
-          <w:rPr>
-            <w:rStyle w:val="Hyperlink"/>
-          </w:rPr>
-          <w:t xml:space="preserve">https://images.ctfassets.net/kftzwdyauwt9/7FFvwejzfPNgfhCnMGL0Zv/1137412461665141a7851dcc703d5e3f/ACP_-_POR__1_.png</w:t>
-        </w:r>
-      </w:hyperlink>
-    </w:p>
-    <w:p>
-      <w:pPr>
-        <w:spacing w:after="120"/>
-      </w:pPr>
-      <w:r>
-        <w:rPr>
-          <w:color w:val="6B7280"/>
-          <w:sz w:val="18"/>
-          <w:szCs w:val="18"/>
-        </w:rPr>
-        <w:t xml:space="preserve">Source: https://openai.com/index/buy-it-in-chatgpt    Author: OpenAI    License: Official brand press diagram, used editorially with credit</w:t>
-      </w:r>
-    </w:p>
-    <w:p>
-      <w:pPr>
         <w:pStyle w:val="Heading2"/>
       </w:pPr>
       <w:r>
@@ -1587,7 +1327,7 @@
         <w:t xml:space="preserve">Hero image:  </w:t>
       </w:r>
       <w:r>
-        <w:t xml:space="preserve">Close up, hand holding a phone on the actual ChatGPT app with a shopping-relevant suggestion visible; warm/natural light, green blur background gives room for the headline top third.</w:t>
+        <w:t xml:space="preserve">Sam Altman mid gesture on the OpenAI DevDay stage, dramatic black backdrop with large AI DevDay lettering behind him, warm spotlight on his face and hands; the dark background gives clean room for the headline.</w:t>
       </w:r>
     </w:p>
     <w:p>
@@ -1603,7 +1343,7 @@
         <w:t xml:space="preserve">Alt image queries:  </w:t>
       </w:r>
       <w:r>
-        <w:t xml:space="preserve">person hand phone ChatGPT app shopping close up high resolution   |   AI shopping assistant interface screenshot official press   |   Perplexity Buy with Pro product card screenshot</w:t>
+        <w:t xml:space="preserve">OpenAI DevDay Sam Altman stage photo official   |   person hand phone ChatGPT app shopping close up high resolution   |   OpenAI Instant Checkout demo screen photo</w:t>
       </w:r>
     </w:p>
     <w:p>
@@ -1667,7 +1407,7 @@
         <w:spacing w:after="120"/>
       </w:pPr>
       <w:r>
-        <w:t xml:space="preserve">All five images are officially sourced (Pexels License for the two ChatGPT phone photos, official brand press material for the Perplexity hero art and the OpenAI protocol diagram) and safe to publish with the credits above. Known compromise, flagged rather than hidden: this story is an aggregate data/behavior trend with no single dramatic photographable event, so two slides (3 and 7) use Perplexity's own launch art as declared mood/metaphor rather than a literal interface shot, and two slides (4 and 6) reuse OpenAI's own protocol diagram, which is low on the Charge parameter despite perfect subject match and full rights clearance. No real people are depicted as named individuals; the hands in the two Pexels photos are anonymous stock subjects, not public figures, so no additional sensitivity applies.</w:t>
+        <w:t xml:space="preserve">All three images are officially or freely cleared: the Sam Altman DevDay photo is OpenAI's own official press photo published on openai.com/devday (the actual event where ChatGPT's Instant Checkout, the AI shopping feature this whole story is about, was announced), and the two ChatGPT phone photos are real, unstaged product photography under the Pexels License (free for commercial use). No wire-service (Getty/AFP), no scraped Instagram content, no posed reaction stock, and no diagrams or mood art. Three sources, each used on exactly two slides with a visibly different crop, covering all 6 slides. Sam Altman is a public figure photographed in his public professional role at his own company's own published event photo; the hands in the two Pexels photos are anonymous stock subjects, not identifiable individuals.</w:t>
       </w:r>
     </w:p>
     <w:p>

</xml_diff>